<commit_message>
document should be one pager.
</commit_message>
<xml_diff>
--- a/templates/Packing_List.docx
+++ b/templates/Packing_List.docx
@@ -101,7 +101,7 @@
         <w:tblStyle w:val="Table1"/>
         <w:tblW w:w="10532" w:type="dxa"/>
         <w:jc w:val="left"/>
-        <w:tblInd w:w="-540" w:type="dxa"/>
+        <w:tblInd w:w="-541" w:type="dxa"/>
         <w:tblLayout w:type="fixed"/>
         <w:tblCellMar>
           <w:top w:w="0" w:type="dxa"/>
@@ -113,15 +113,15 @@
       </w:tblPr>
       <w:tblGrid>
         <w:gridCol w:w="1615"/>
-        <w:gridCol w:w="1451"/>
-        <w:gridCol w:w="249"/>
+        <w:gridCol w:w="1450"/>
+        <w:gridCol w:w="250"/>
         <w:gridCol w:w="117"/>
         <w:gridCol w:w="1484"/>
         <w:gridCol w:w="1183"/>
         <w:gridCol w:w="483"/>
         <w:gridCol w:w="968"/>
-        <w:gridCol w:w="1917"/>
-        <w:gridCol w:w="1064"/>
+        <w:gridCol w:w="1918"/>
+        <w:gridCol w:w="1063"/>
       </w:tblGrid>
       <w:tr>
         <w:trPr>
@@ -532,7 +532,6 @@
               <w:keepNext w:val="false"/>
               <w:keepLines w:val="false"/>
               <w:widowControl w:val="false"/>
-              <w:pBdr/>
               <w:shd w:val="clear" w:fill="auto"/>
               <w:spacing w:lineRule="auto" w:line="276" w:before="0" w:after="0"/>
               <w:ind w:hanging="0" w:left="0" w:right="0"/>
@@ -731,7 +730,7 @@
       </w:tr>
       <w:tr>
         <w:trPr>
-          <w:trHeight w:val="1027" w:hRule="atLeast"/>
+          <w:trHeight w:val="885" w:hRule="atLeast"/>
         </w:trPr>
         <w:tc>
           <w:tcPr>
@@ -1694,7 +1693,6 @@
               <w:keepNext w:val="false"/>
               <w:keepLines w:val="false"/>
               <w:widowControl w:val="false"/>
-              <w:pBdr/>
               <w:shd w:val="clear" w:fill="auto"/>
               <w:spacing w:lineRule="auto" w:line="276" w:before="0" w:after="0"/>
               <w:ind w:hanging="0" w:left="0" w:right="0"/>
@@ -1717,7 +1715,7 @@
       </w:tr>
       <w:tr>
         <w:trPr>
-          <w:trHeight w:val="388" w:hRule="atLeast"/>
+          <w:trHeight w:val="751" w:hRule="atLeast"/>
         </w:trPr>
         <w:tc>
           <w:tcPr>
@@ -1857,7 +1855,7 @@
         </w:tc>
         <w:tc>
           <w:tcPr>
-            <w:tcW w:w="1451" w:type="dxa"/>
+            <w:tcW w:w="1450" w:type="dxa"/>
             <w:tcBorders>
               <w:top w:val="single" w:sz="4" w:space="0" w:color="000000"/>
               <w:left w:val="single" w:sz="4" w:space="0" w:color="000000"/>
@@ -1906,7 +1904,7 @@
         </w:tc>
         <w:tc>
           <w:tcPr>
-            <w:tcW w:w="6401" w:type="dxa"/>
+            <w:tcW w:w="6403" w:type="dxa"/>
             <w:gridSpan w:val="7"/>
             <w:tcBorders>
               <w:top w:val="single" w:sz="4" w:space="0" w:color="000000"/>
@@ -1956,7 +1954,7 @@
         </w:tc>
         <w:tc>
           <w:tcPr>
-            <w:tcW w:w="1064" w:type="dxa"/>
+            <w:tcW w:w="1063" w:type="dxa"/>
             <w:tcBorders>
               <w:top w:val="single" w:sz="4" w:space="0" w:color="000000"/>
               <w:left w:val="single" w:sz="4" w:space="0" w:color="000000"/>
@@ -2006,7 +2004,7 @@
       </w:tr>
       <w:tr>
         <w:trPr>
-          <w:trHeight w:val="2140" w:hRule="atLeast"/>
+          <w:trHeight w:val="1721" w:hRule="atLeast"/>
         </w:trPr>
         <w:tc>
           <w:tcPr>
@@ -2170,7 +2168,7 @@
         </w:tc>
         <w:tc>
           <w:tcPr>
-            <w:tcW w:w="1451" w:type="dxa"/>
+            <w:tcW w:w="1450" w:type="dxa"/>
             <w:tcBorders>
               <w:top w:val="single" w:sz="4" w:space="0" w:color="000000"/>
               <w:left w:val="single" w:sz="4" w:space="0" w:color="000000"/>
@@ -2221,7 +2219,7 @@
         </w:tc>
         <w:tc>
           <w:tcPr>
-            <w:tcW w:w="6401" w:type="dxa"/>
+            <w:tcW w:w="6403" w:type="dxa"/>
             <w:gridSpan w:val="7"/>
             <w:tcBorders>
               <w:top w:val="single" w:sz="4" w:space="0" w:color="000000"/>
@@ -2273,7 +2271,7 @@
         </w:tc>
         <w:tc>
           <w:tcPr>
-            <w:tcW w:w="1064" w:type="dxa"/>
+            <w:tcW w:w="1063" w:type="dxa"/>
             <w:tcBorders>
               <w:top w:val="single" w:sz="4" w:space="0" w:color="000000"/>
               <w:left w:val="single" w:sz="4" w:space="0" w:color="000000"/>
@@ -2716,7 +2714,6 @@
               <w:keepNext w:val="false"/>
               <w:keepLines w:val="false"/>
               <w:widowControl w:val="false"/>
-              <w:pBdr/>
               <w:shd w:val="clear" w:fill="auto"/>
               <w:spacing w:lineRule="auto" w:line="276" w:before="0" w:after="0"/>
               <w:ind w:hanging="0" w:left="0" w:right="0"/>
@@ -2857,7 +2854,6 @@
               <w:keepNext w:val="false"/>
               <w:keepLines w:val="false"/>
               <w:widowControl w:val="false"/>
-              <w:pBdr/>
               <w:shd w:val="clear" w:fill="auto"/>
               <w:spacing w:lineRule="auto" w:line="276" w:before="0" w:after="0"/>
               <w:ind w:hanging="0" w:left="0" w:right="0"/>
@@ -2998,7 +2994,6 @@
               <w:keepNext w:val="false"/>
               <w:keepLines w:val="false"/>
               <w:widowControl w:val="false"/>
-              <w:pBdr/>
               <w:shd w:val="clear" w:fill="auto"/>
               <w:spacing w:lineRule="auto" w:line="276" w:before="0" w:after="0"/>
               <w:ind w:hanging="0" w:left="0" w:right="0"/>
@@ -3148,76 +3143,9 @@
     </w:tbl>
     <w:p>
       <w:pPr>
-        <w:pStyle w:val="normal11"/>
-        <w:keepNext w:val="false"/>
-        <w:keepLines w:val="false"/>
+        <w:pStyle w:val="Heading2"/>
         <w:pageBreakBefore w:val="false"/>
-        <w:widowControl w:val="false"/>
-        <w:shd w:val="clear" w:fill="auto"/>
-        <w:spacing w:lineRule="auto" w:line="240" w:before="0" w:after="0"/>
-        <w:ind w:hanging="0" w:left="0" w:right="0"/>
-        <w:jc w:val="left"/>
-        <w:rPr>
-          <w:rFonts w:ascii="Times New Roman" w:hAnsi="Times New Roman" w:eastAsia="Times New Roman" w:cs="Times New Roman"/>
-          <w:b w:val="false"/>
-          <w:bCs w:val="false"/>
-          <w:i w:val="false"/>
-          <w:i w:val="false"/>
-          <w:iCs w:val="false"/>
-          <w:caps w:val="false"/>
-          <w:smallCaps w:val="false"/>
-          <w:strike w:val="false"/>
-          <w:dstrike w:val="false"/>
-          <w:color w:val="000000"/>
-          <w:position w:val="0"/>
-          <w:sz w:val="34"/>
-          <w:sz w:val="34"/>
-          <w:szCs w:val="34"/>
-          <w:u w:val="none"/>
-          <w:shd w:fill="auto" w:val="clear"/>
-          <w:vertAlign w:val="baseline"/>
-        </w:rPr>
-      </w:pPr>
-      <w:r>
-        <w:rPr>
-          <w:rFonts w:eastAsia="Times New Roman" w:cs="Times New Roman" w:ascii="Times New Roman" w:hAnsi="Times New Roman"/>
-          <w:b w:val="false"/>
-          <w:bCs w:val="false"/>
-          <w:i w:val="false"/>
-          <w:iCs w:val="false"/>
-          <w:caps w:val="false"/>
-          <w:smallCaps w:val="false"/>
-          <w:strike w:val="false"/>
-          <w:dstrike w:val="false"/>
-          <w:color w:val="000000"/>
-          <w:position w:val="0"/>
-          <w:sz w:val="34"/>
-          <w:sz w:val="34"/>
-          <w:szCs w:val="34"/>
-          <w:u w:val="none"/>
-          <w:shd w:fill="auto" w:val="clear"/>
-          <w:vertAlign w:val="baseline"/>
-        </w:rPr>
-      </w:r>
-    </w:p>
-    <w:p>
-      <w:pPr>
-        <w:pStyle w:val="Heading2"/>
         <w:ind w:hanging="0" w:left="234"/>
-        <w:rPr>
-          <w:color w:val="AE1DA3"/>
-        </w:rPr>
-      </w:pPr>
-      <w:r>
-        <w:rPr>
-          <w:color w:val="AE1DA3"/>
-        </w:rPr>
-      </w:r>
-    </w:p>
-    <w:p>
-      <w:pPr>
-        <w:pStyle w:val="Heading2"/>
-        <w:ind w:firstLine="234" w:left="234"/>
         <w:rPr/>
       </w:pPr>
       <w:r>
@@ -3411,6 +3339,7 @@
     <w:qFormat/>
     <w:pPr>
       <w:widowControl w:val="false"/>
+      <w:suppressAutoHyphens w:val="true"/>
       <w:bidi w:val="0"/>
       <w:spacing w:before="0" w:after="0"/>
       <w:jc w:val="left"/>
@@ -3609,6 +3538,7 @@
     <w:qFormat/>
     <w:pPr>
       <w:widowControl w:val="false"/>
+      <w:suppressAutoHyphens w:val="true"/>
       <w:bidi w:val="0"/>
       <w:spacing w:before="0" w:after="0"/>
       <w:jc w:val="left"/>

</xml_diff>